<commit_message>
Add admin appendix on creating the Brevo SMTP setup key
The guide told team members "I'll send you the setup key separately" but
never covered how that key is made. Append an admin-only appendix with the
Brevo steps (SMTP & API -> SMTP tab -> Generate a new SMTP key), the
shown-once caveat, and notes on forwarding being required before Gmail
verification.
</commit_message>
<xml_diff>
--- a/Transport-Futures-Email-Setup.docx
+++ b/Transport-Futures-Email-Setup.docx
@@ -514,6 +514,184 @@
         <w:t>Anteneh</w:t>
       </w:r>
     </w:p>
+    <w:p>
+      <w:pPr>
+        <w:pStyle w:val="Heading1"/>
+        <w:spacing w:before="360"/>
+      </w:pPr>
+      <w:r>
+        <w:rPr>
+          <w:b w:val="0"/>
+          <w:i w:val="0"/>
+        </w:rPr>
+        <w:t>Appendix — Creating the setup key (admin only)</w:t>
+      </w:r>
+    </w:p>
+    <w:p>
+      <w:r>
+        <w:rPr>
+          <w:b w:val="0"/>
+          <w:i w:val="0"/>
+        </w:rPr>
+        <w:t>Team members can ignore this section. The setup key referred to above is a Brevo SMTP key, created once by whoever administers the Transport Futures Brevo account and then shared privately with each person.</w:t>
+      </w:r>
+    </w:p>
+    <w:p>
+      <w:pPr>
+        <w:spacing w:before="160" w:after="80"/>
+      </w:pPr>
+      <w:r>
+        <w:rPr>
+          <w:b/>
+          <w:i w:val="0"/>
+        </w:rPr>
+        <w:t>Create the key</w:t>
+      </w:r>
+    </w:p>
+    <w:p>
+      <w:pPr>
+        <w:pStyle w:val="ListNumber"/>
+      </w:pPr>
+      <w:r>
+        <w:rPr>
+          <w:b w:val="0"/>
+          <w:i w:val="0"/>
+        </w:rPr>
+        <w:t>Go to app.brevo.com and log in to the Transport Futures account.</w:t>
+      </w:r>
+    </w:p>
+    <w:p>
+      <w:pPr>
+        <w:pStyle w:val="ListNumber"/>
+      </w:pPr>
+      <w:r>
+        <w:rPr>
+          <w:b w:val="0"/>
+          <w:i w:val="0"/>
+        </w:rPr>
+        <w:t>Click the account name (top-right), then SMTP &amp; API. (Direct link: https://app.brevo.com/settings/keys/smtp)</w:t>
+      </w:r>
+    </w:p>
+    <w:p>
+      <w:pPr>
+        <w:pStyle w:val="ListNumber"/>
+      </w:pPr>
+      <w:r>
+        <w:rPr>
+          <w:b w:val="0"/>
+          <w:i w:val="0"/>
+        </w:rPr>
+        <w:t>Open the SMTP tab — not “API Keys”. They are different keys, and only the SMTP one works for Gmail.</w:t>
+      </w:r>
+    </w:p>
+    <w:p>
+      <w:pPr>
+        <w:pStyle w:val="ListNumber"/>
+      </w:pPr>
+      <w:r>
+        <w:rPr>
+          <w:b w:val="0"/>
+          <w:i w:val="0"/>
+        </w:rPr>
+        <w:t>This page also shows the values used on the Gmail SMTP screen above: server smtp-relay.brevo.com, port 587, and the Login (username).</w:t>
+      </w:r>
+    </w:p>
+    <w:p>
+      <w:pPr>
+        <w:pStyle w:val="ListNumber"/>
+      </w:pPr>
+      <w:r>
+        <w:rPr>
+          <w:b w:val="0"/>
+          <w:i w:val="0"/>
+        </w:rPr>
+        <w:t>Click “Generate a new SMTP key”, give it a name (e.g. the person's first name), then click Generate.</w:t>
+      </w:r>
+    </w:p>
+    <w:p>
+      <w:pPr>
+        <w:pStyle w:val="ListNumber"/>
+      </w:pPr>
+      <w:r>
+        <w:rPr>
+          <w:b w:val="0"/>
+          <w:i w:val="0"/>
+        </w:rPr>
+        <w:t>Copy the key immediately. It begins with xsmtpsib- and is shown only once — if it's lost, simply generate a new one.</w:t>
+      </w:r>
+    </w:p>
+    <w:p>
+      <w:pPr>
+        <w:pStyle w:val="ListNumber"/>
+      </w:pPr>
+      <w:r>
+        <w:rPr>
+          <w:b w:val="0"/>
+          <w:i w:val="0"/>
+        </w:rPr>
+        <w:t>Send the key to the person privately (not in a shared doc or group chat). This is the “setup key” mentioned earlier in this guide.</w:t>
+      </w:r>
+    </w:p>
+    <w:p>
+      <w:pPr>
+        <w:spacing w:before="200" w:after="80"/>
+      </w:pPr>
+      <w:r>
+        <w:rPr>
+          <w:b/>
+          <w:i w:val="0"/>
+        </w:rPr>
+        <w:t>Good to know</w:t>
+      </w:r>
+    </w:p>
+    <w:p>
+      <w:pPr>
+        <w:pStyle w:val="ListBullet2"/>
+      </w:pPr>
+      <w:r>
+        <w:rPr>
+          <w:b w:val="0"/>
+          <w:i w:val="0"/>
+        </w:rPr>
+        <w:t>Multiple SMTP keys can exist at the same time, so generating a new one never breaks anyone's existing setup. You can reuse one key across the team or issue one per person.</w:t>
+      </w:r>
+    </w:p>
+    <w:p>
+      <w:pPr>
+        <w:pStyle w:val="ListBullet2"/>
+      </w:pPr>
+      <w:r>
+        <w:rPr>
+          <w:b w:val="0"/>
+          <w:i w:val="0"/>
+        </w:rPr>
+        <w:t>The Username is the same for everyone — only the key acts as the password.</w:t>
+      </w:r>
+    </w:p>
+    <w:p>
+      <w:pPr>
+        <w:pStyle w:val="ListBullet2"/>
+      </w:pPr>
+      <w:r>
+        <w:rPr>
+          <w:b w:val="0"/>
+          <w:i w:val="0"/>
+        </w:rPr>
+        <w:t>Before adding a new address in Gmail, make sure that address is already forwarding (Cloudflare Email Routing). Gmail sends a verification code to it, so it must reach a real inbox — mail to an address with no forwarding rule is dropped.</w:t>
+      </w:r>
+    </w:p>
+    <w:p>
+      <w:pPr>
+        <w:pStyle w:val="ListBullet2"/>
+      </w:pPr>
+      <w:r>
+        <w:rPr>
+          <w:b w:val="0"/>
+          <w:i w:val="0"/>
+        </w:rPr>
+        <w:t>Treat keys like passwords: anyone holding one can send mail as @transportfutures.org.</w:t>
+      </w:r>
+    </w:p>
     <w:sectPr>
       <w:pgSz w:w="12240" w:h="15840"/>
       <w:pgMar w:top="1440" w:right="1800" w:bottom="1440" w:left="1800" w:header="720" w:footer="720" w:gutter="0"/>

</xml_diff>